<commit_message>
carga de la documetacion del proyecto
</commit_message>
<xml_diff>
--- a/documentos backend/plan de accion/PLAN DE ACCIÓN DESARROLLO BACKEND FOAMWASH.docx
+++ b/documentos backend/plan de accion/PLAN DE ACCIÓN DESARROLLO BACKEND FOAMWASH.docx
@@ -7614,14 +7614,7 @@
           <w:sz w:val="28"/>
           <w:szCs w:val="28"/>
         </w:rPr>
-        <w:t xml:space="preserve">Documento: </w:t>
-      </w:r>
-      <w:r>
-        <w:rPr>
-          <w:sz w:val="28"/>
-          <w:szCs w:val="28"/>
-        </w:rPr>
-        <w:t xml:space="preserve">Plan De Acción: Desarrollo Backend </w:t>
+        <w:t xml:space="preserve">Documento: Plan De Acción: Desarrollo Backend </w:t>
       </w:r>
       <w:proofErr w:type="spellStart"/>
       <w:r>
@@ -11676,6 +11669,7 @@
   <w:style w:type="character" w:default="1" w:styleId="Fuentedeprrafopredeter">
     <w:name w:val="Default Paragraph Font"/>
     <w:uiPriority w:val="1"/>
+    <w:semiHidden/>
     <w:unhideWhenUsed/>
   </w:style>
   <w:style w:type="table" w:default="1" w:styleId="Tablanormal">

</xml_diff>